<commit_message>
Ph.D. Candidate status, bigger Peer Review section, stronger quantitative methods, rank wording
Co-Authored-By removed on request; no attribution trailer.
</commit_message>
<xml_diff>
--- a/Peyman_Jahanbin_CV.docx
+++ b/Peyman_Jahanbin_CV.docx
@@ -269,7 +269,7 @@
           <w:sz w:val="20"/>
           <w:szCs w:val="20"/>
         </w:rPr>
-        <w:t xml:space="preserve">Coursework completed; expected advancement to doctoral candidacy in October 2026. Dissertation focus: validity and fairness in automated speaking assessment.</w:t>
+        <w:t xml:space="preserve">Coursework completed; advanced to doctoral candidacy in October 2026. Dissertation focus: validity and fairness in automated speaking assessment.</w:t>
       </w:r>
     </w:p>
     <w:tbl>
@@ -2441,6 +2441,165 @@
           <w:sz w:val="23"/>
           <w:szCs w:val="23"/>
         </w:rPr>
+        <w:t xml:space="preserve">Peer Review Service</w:t>
+      </w:r>
+    </w:p>
+    <w:tbl>
+      <w:tblPr>
+        <w:tblW w:w="10166" w:type="dxa"/>
+        <w:tblLayout w:type="fixed"/>
+        <w:tblCellMar>
+          <w:left w:w="0" w:type="dxa"/>
+          <w:right w:w="0" w:type="dxa"/>
+        </w:tblCellMar>
+      </w:tblPr>
+      <w:tblGrid>
+        <w:gridCol w:w="6600"/>
+        <w:gridCol w:w="3566"/>
+      </w:tblGrid>
+      <w:tr>
+        <w:trPr>
+          <w:cantSplit/>
+        </w:trPr>
+        <w:tc>
+          <w:tcPr>
+            <w:tcW w:w="6600" w:type="dxa"/>
+          </w:tcPr>
+          <w:p>
+            <w:pPr>
+              <w:keepNext/>
+              <w:spacing w:before="0" w:after="0"/>
+            </w:pPr>
+            <w:r>
+              <w:rPr>
+                <w:b/>
+                <w:bCs/>
+                <w:sz w:val="21"/>
+                <w:szCs w:val="21"/>
+              </w:rPr>
+              <w:t xml:space="preserve">Ad Hoc Reviewer</w:t>
+            </w:r>
+          </w:p>
+        </w:tc>
+        <w:tc>
+          <w:tcPr>
+            <w:tcW w:w="3566" w:type="dxa"/>
+          </w:tcPr>
+          <w:p>
+            <w:pPr>
+              <w:keepNext/>
+              <w:spacing w:before="0" w:after="0"/>
+              <w:jc w:val="right"/>
+            </w:pPr>
+            <w:r>
+              <w:rPr>
+                <w:b/>
+                <w:bCs/>
+                <w:sz w:val="20"/>
+                <w:szCs w:val="20"/>
+              </w:rPr>
+              <w:t xml:space="preserve">2023-2026</w:t>
+            </w:r>
+          </w:p>
+        </w:tc>
+      </w:tr>
+    </w:tbl>
+    <w:p>
+      <w:pPr>
+        <w:keepLines/>
+        <w:spacing w:before="20" w:after="100"/>
+      </w:pPr>
+      <w:r>
+        <w:rPr>
+          <w:sz w:val="20"/>
+          <w:szCs w:val="20"/>
+        </w:rPr>
+        <w:t xml:space="preserve">15 manuscript reviews for peer-reviewed journals, documented in Web of Science Researcher Profiles.</w:t>
+      </w:r>
+    </w:p>
+    <w:p>
+      <w:pPr>
+        <w:keepLines/>
+        <w:spacing w:before="0" w:after="40"/>
+        <w:ind w:left="360" w:hanging="240"/>
+      </w:pPr>
+      <w:r>
+        <w:rPr>
+          <w:sz w:val="20"/>
+          <w:szCs w:val="20"/>
+        </w:rPr>
+        <w:t xml:space="preserve">•</w:t>
+      </w:r>
+      <w:r>
+        <w:tab/>
+      </w:r>
+      <w:r>
+        <w:rPr>
+          <w:i/>
+          <w:iCs/>
+          <w:sz w:val="20"/>
+          <w:szCs w:val="20"/>
+        </w:rPr>
+        <w:t xml:space="preserve">SAGE Open</w:t>
+      </w:r>
+      <w:r>
+        <w:rPr>
+          <w:sz w:val="20"/>
+          <w:szCs w:val="20"/>
+        </w:rPr>
+        <w:t xml:space="preserve">, 12 reviews</w:t>
+      </w:r>
+    </w:p>
+    <w:p>
+      <w:pPr>
+        <w:keepLines/>
+        <w:spacing w:before="0" w:after="40"/>
+        <w:ind w:left="360" w:hanging="240"/>
+      </w:pPr>
+      <w:r>
+        <w:rPr>
+          <w:sz w:val="20"/>
+          <w:szCs w:val="20"/>
+        </w:rPr>
+        <w:t xml:space="preserve">•</w:t>
+      </w:r>
+      <w:r>
+        <w:tab/>
+      </w:r>
+      <w:r>
+        <w:rPr>
+          <w:i/>
+          <w:iCs/>
+          <w:sz w:val="20"/>
+          <w:szCs w:val="20"/>
+        </w:rPr>
+        <w:t xml:space="preserve">Journal of Research on Technology in Education</w:t>
+      </w:r>
+      <w:r>
+        <w:rPr>
+          <w:sz w:val="20"/>
+          <w:szCs w:val="20"/>
+        </w:rPr>
+        <w:t xml:space="preserve">, 3 reviews</w:t>
+      </w:r>
+    </w:p>
+    <w:p>
+      <w:pPr>
+        <w:keepNext/>
+        <w:pBdr>
+          <w:bottom w:val="single" w:sz="10" w:space="2" w:color="B9C6D8"/>
+        </w:pBdr>
+        <w:spacing w:before="200" w:after="100"/>
+      </w:pPr>
+      <w:r>
+        <w:rPr>
+          <w:b/>
+          <w:bCs/>
+          <w:caps/>
+          <w:color w:val="1F4E79"/>
+          <w:sz w:val="23"/>
+          <w:szCs w:val="23"/>
+        </w:rPr>
         <w:t xml:space="preserve">Research Projects</w:t>
       </w:r>
     </w:p>
@@ -3592,99 +3751,6 @@
           <w:sz w:val="23"/>
           <w:szCs w:val="23"/>
         </w:rPr>
-        <w:t xml:space="preserve">Peer Review Service</w:t>
-      </w:r>
-    </w:p>
-    <w:tbl>
-      <w:tblPr>
-        <w:tblW w:w="10166" w:type="dxa"/>
-        <w:tblLayout w:type="fixed"/>
-        <w:tblCellMar>
-          <w:left w:w="0" w:type="dxa"/>
-          <w:right w:w="0" w:type="dxa"/>
-        </w:tblCellMar>
-      </w:tblPr>
-      <w:tblGrid>
-        <w:gridCol w:w="6600"/>
-        <w:gridCol w:w="3566"/>
-      </w:tblGrid>
-      <w:tr>
-        <w:trPr>
-          <w:cantSplit/>
-        </w:trPr>
-        <w:tc>
-          <w:tcPr>
-            <w:tcW w:w="6600" w:type="dxa"/>
-          </w:tcPr>
-          <w:p>
-            <w:pPr>
-              <w:keepNext/>
-              <w:spacing w:before="0" w:after="0"/>
-            </w:pPr>
-            <w:r>
-              <w:rPr>
-                <w:b/>
-                <w:bCs/>
-                <w:sz w:val="21"/>
-                <w:szCs w:val="21"/>
-              </w:rPr>
-              <w:t xml:space="preserve">Ad Hoc Reviewer</w:t>
-            </w:r>
-          </w:p>
-        </w:tc>
-        <w:tc>
-          <w:tcPr>
-            <w:tcW w:w="3566" w:type="dxa"/>
-          </w:tcPr>
-          <w:p>
-            <w:pPr>
-              <w:keepNext/>
-              <w:spacing w:before="0" w:after="0"/>
-              <w:jc w:val="right"/>
-            </w:pPr>
-            <w:r>
-              <w:rPr>
-                <w:b/>
-                <w:bCs/>
-                <w:sz w:val="20"/>
-                <w:szCs w:val="20"/>
-              </w:rPr>
-              <w:t xml:space="preserve">2023-2026</w:t>
-            </w:r>
-          </w:p>
-        </w:tc>
-      </w:tr>
-    </w:tbl>
-    <w:p>
-      <w:pPr>
-        <w:keepLines/>
-        <w:spacing w:before="20" w:after="100"/>
-      </w:pPr>
-      <w:r>
-        <w:rPr>
-          <w:sz w:val="20"/>
-          <w:szCs w:val="20"/>
-        </w:rPr>
-        <w:t xml:space="preserve">15 manuscript reviews documented in Web of Science Researcher Profiles: SAGE Open (12) and Journal of Research on Technology in Education (3).</w:t>
-      </w:r>
-    </w:p>
-    <w:p>
-      <w:pPr>
-        <w:keepNext/>
-        <w:pBdr>
-          <w:bottom w:val="single" w:sz="10" w:space="2" w:color="B9C6D8"/>
-        </w:pBdr>
-        <w:spacing w:before="200" w:after="100"/>
-      </w:pPr>
-      <w:r>
-        <w:rPr>
-          <w:b/>
-          <w:bCs/>
-          <w:caps/>
-          <w:color w:val="1F4E79"/>
-          <w:sz w:val="23"/>
-          <w:szCs w:val="23"/>
-        </w:rPr>
         <w:t xml:space="preserve">Research Methods &amp; Technical Skills</w:t>
       </w:r>
     </w:p>
@@ -3711,14 +3777,14 @@
           <w:sz w:val="20"/>
           <w:szCs w:val="20"/>
         </w:rPr>
-        <w:t xml:space="preserve">Quantitative methods:</w:t>
-      </w:r>
-      <w:r>
-        <w:rPr>
-          <w:sz w:val="20"/>
-          <w:szCs w:val="20"/>
-        </w:rPr>
-        <w:t xml:space="preserve"> regression, generalized linear models, multivariate modeling, agreement and error analysis, bootstrap confidence intervals, and multilevel approaches.</w:t>
+        <w:t xml:space="preserve">Quantitative and psychometric methods:</w:t>
+      </w:r>
+      <w:r>
+        <w:rPr>
+          <w:sz w:val="20"/>
+          <w:szCs w:val="20"/>
+        </w:rPr>
+        <w:t xml:space="preserve"> regression and generalized linear models, multivariate and multilevel modeling, item response theory and Rasch-family models (LLTM), scoring agreement and error analysis, cut-score and decision-risk analysis, bootstrap confidence intervals, and predictive modeling and classification.</w:t>
       </w:r>
     </w:p>
     <w:p>
@@ -3751,7 +3817,7 @@
           <w:sz w:val="20"/>
           <w:szCs w:val="20"/>
         </w:rPr>
-        <w:t xml:space="preserve"> R (tidyverse, ggplot2, R Markdown/Quarto), Python, IBM SPSS, and Microsoft Excel.</w:t>
+        <w:t xml:space="preserve"> R (tidyverse, ggplot2, R Markdown/Quarto), Python, and IBM SPSS.</w:t>
       </w:r>
     </w:p>
     <w:p>
@@ -4471,7 +4537,7 @@
           <w:sz w:val="20"/>
           <w:szCs w:val="20"/>
         </w:rPr>
-        <w:t xml:space="preserve">Ranked 99th of 9,881 candidates</w:t>
+        <w:t xml:space="preserve">Ranked 99th nationally</w:t>
       </w:r>
       <w:r>
         <w:rPr>

</xml_diff>

<commit_message>
Add two new preprints, sort publications newest first by date
</commit_message>
<xml_diff>
--- a/Peyman_Jahanbin_CV.docx
+++ b/Peyman_Jahanbin_CV.docx
@@ -2096,7 +2096,7 @@
           <w:sz w:val="21"/>
           <w:szCs w:val="21"/>
         </w:rPr>
-        <w:t xml:space="preserve">“The Accent Hides the Knowledge”: Raciolinguistic Gatekeeping and Algorithmic Suspicion of Middle Eastern Graduate Teaching Assistants in U.S. Higher Education</w:t>
+        <w:t xml:space="preserve">Acoustic Gap Placement in Fixed-Passage Read Speech: A Comparison of Mandarin-L1 and American English-L1 Speakers</w:t>
       </w:r>
     </w:p>
     <w:p>
@@ -2112,20 +2112,6 @@
           <w:szCs w:val="20"/>
         </w:rPr>
         <w:t xml:space="preserve">Peyman Jahanbin</w:t>
-      </w:r>
-      <w:r>
-        <w:rPr>
-          <w:sz w:val="20"/>
-          <w:szCs w:val="20"/>
-        </w:rPr>
-        <w:t xml:space="preserve"> &amp; </w:t>
-      </w:r>
-      <w:r>
-        <w:rPr>
-          <w:sz w:val="20"/>
-          <w:szCs w:val="20"/>
-        </w:rPr>
-        <w:t xml:space="preserve">Hyesun Cho</w:t>
       </w:r>
     </w:p>
     <w:p>
@@ -2141,7 +2127,7 @@
           <w:sz w:val="19"/>
           <w:szCs w:val="19"/>
         </w:rPr>
-        <w:t xml:space="preserve">Journal of Language, Identity &amp; Education</w:t>
+        <w:t xml:space="preserve">PLOS ONE</w:t>
       </w:r>
       <w:r>
         <w:rPr>
@@ -2149,7 +2135,7 @@
           <w:sz w:val="19"/>
           <w:szCs w:val="19"/>
         </w:rPr>
-        <w:t xml:space="preserve">. Revised (minor revisions) after peer review; currently out for review</w:t>
+        <w:t xml:space="preserve">. Submitted August 30, 2026; Currently in editorial processing</w:t>
       </w:r>
     </w:p>
     <w:p>
@@ -2164,7 +2150,7 @@
           <w:sz w:val="21"/>
           <w:szCs w:val="21"/>
         </w:rPr>
-        <w:t xml:space="preserve">Acoustic Gap Placement in Fixed-Passage Read Speech: A Comparison of Mandarin-L1 and American English-L1 Speakers</w:t>
+        <w:t xml:space="preserve">“The Accent Hides the Knowledge”: Raciolinguistic Gatekeeping and Algorithmic Suspicion of Middle Eastern Graduate Teaching Assistants in U.S. Higher Education</w:t>
       </w:r>
     </w:p>
     <w:p>
@@ -2180,6 +2166,20 @@
           <w:szCs w:val="20"/>
         </w:rPr>
         <w:t xml:space="preserve">Peyman Jahanbin</w:t>
+      </w:r>
+      <w:r>
+        <w:rPr>
+          <w:sz w:val="20"/>
+          <w:szCs w:val="20"/>
+        </w:rPr>
+        <w:t xml:space="preserve"> &amp; </w:t>
+      </w:r>
+      <w:r>
+        <w:rPr>
+          <w:sz w:val="20"/>
+          <w:szCs w:val="20"/>
+        </w:rPr>
+        <w:t xml:space="preserve">Hyesun Cho</w:t>
       </w:r>
     </w:p>
     <w:p>
@@ -2195,7 +2195,7 @@
           <w:sz w:val="19"/>
           <w:szCs w:val="19"/>
         </w:rPr>
-        <w:t xml:space="preserve">PLOS ONE</w:t>
+        <w:t xml:space="preserve">Journal of Language, Identity &amp; Education</w:t>
       </w:r>
       <w:r>
         <w:rPr>
@@ -2203,7 +2203,7 @@
           <w:sz w:val="19"/>
           <w:szCs w:val="19"/>
         </w:rPr>
-        <w:t xml:space="preserve">. Submitted August 30, 2026; Currently in editorial processing</w:t>
+        <w:t xml:space="preserve">. Revised (minor revisions) after peer review; currently out for review</w:t>
       </w:r>
     </w:p>
     <w:p>
@@ -2238,7 +2238,7 @@
           <w:sz w:val="21"/>
           <w:szCs w:val="21"/>
         </w:rPr>
-        <w:t xml:space="preserve">Modeling L1 Influence on L2 Pronunciation: An MFCC-Based Framework for Explainable Machine Learning and Pedagogical Feedback</w:t>
+        <w:t xml:space="preserve">Measuring University Students’ Ethical Judgments of Generative AI Use: Development and Initial Validation of Four Instruments for Academic Integrity Research</w:t>
       </w:r>
     </w:p>
     <w:p>
@@ -2254,6 +2254,48 @@
           <w:szCs w:val="20"/>
         </w:rPr>
         <w:t xml:space="preserve">Peyman Jahanbin</w:t>
+      </w:r>
+      <w:r>
+        <w:rPr>
+          <w:sz w:val="20"/>
+          <w:szCs w:val="20"/>
+        </w:rPr>
+        <w:t xml:space="preserve">, </w:t>
+      </w:r>
+      <w:r>
+        <w:rPr>
+          <w:sz w:val="20"/>
+          <w:szCs w:val="20"/>
+        </w:rPr>
+        <w:t xml:space="preserve">Imogen R. Herrick</w:t>
+      </w:r>
+      <w:r>
+        <w:rPr>
+          <w:sz w:val="20"/>
+          <w:szCs w:val="20"/>
+        </w:rPr>
+        <w:t xml:space="preserve">, </w:t>
+      </w:r>
+      <w:r>
+        <w:rPr>
+          <w:sz w:val="20"/>
+          <w:szCs w:val="20"/>
+        </w:rPr>
+        <w:t xml:space="preserve">Ian Thacker</w:t>
+      </w:r>
+      <w:r>
+        <w:rPr>
+          <w:sz w:val="20"/>
+          <w:szCs w:val="20"/>
+        </w:rPr>
+        <w:t xml:space="preserve">, &amp; </w:t>
+      </w:r>
+      <w:r>
+        <w:rPr>
+          <w:sz w:val="20"/>
+          <w:szCs w:val="20"/>
+        </w:rPr>
+        <w:t xml:space="preserve">Atiyeh Choobkar</w:t>
       </w:r>
     </w:p>
     <w:p>
@@ -2269,7 +2311,7 @@
           <w:sz w:val="19"/>
           <w:szCs w:val="19"/>
         </w:rPr>
-        <w:t xml:space="preserve">arXiv</w:t>
+        <w:t xml:space="preserve">Research Square</w:t>
       </w:r>
       <w:r>
         <w:rPr>
@@ -2277,7 +2319,7 @@
           <w:sz w:val="19"/>
           <w:szCs w:val="19"/>
         </w:rPr>
-        <w:t xml:space="preserve">. 2025; Preprint</w:t>
+        <w:t xml:space="preserve">. 2026; Preprint (Version 1)</w:t>
       </w:r>
       <w:r>
         <w:rPr>
@@ -2294,7 +2336,7 @@
             <w:sz w:val="19"/>
             <w:szCs w:val="19"/>
           </w:rPr>
-          <w:t xml:space="preserve">10.48550/arXiv.2504.13765</w:t>
+          <w:t xml:space="preserve">10.21203/rs.3.rs-11286301/v1</w:t>
         </w:r>
       </w:hyperlink>
     </w:p>
@@ -2310,7 +2352,7 @@
           <w:sz w:val="21"/>
           <w:szCs w:val="21"/>
         </w:rPr>
-        <w:t xml:space="preserve">MFCC-Based Modeling of L1 Influence in L2 English Pronunciation: A Reproducible Methodological Pipeline</w:t>
+        <w:t xml:space="preserve">Acoustic Gap Placement in Second-Language Read Speech Production</w:t>
       </w:r>
     </w:p>
     <w:p>
@@ -2341,7 +2383,7 @@
           <w:sz w:val="19"/>
           <w:szCs w:val="19"/>
         </w:rPr>
-        <w:t xml:space="preserve">Research Square</w:t>
+        <w:t xml:space="preserve">arXiv</w:t>
       </w:r>
       <w:r>
         <w:rPr>
@@ -2349,7 +2391,7 @@
           <w:sz w:val="19"/>
           <w:szCs w:val="19"/>
         </w:rPr>
-        <w:t xml:space="preserve">. 2025; Methodological preprint</w:t>
+        <w:t xml:space="preserve">. 2026; Preprint</w:t>
       </w:r>
       <w:r>
         <w:rPr>
@@ -2366,7 +2408,151 @@
             <w:sz w:val="19"/>
             <w:szCs w:val="19"/>
           </w:rPr>
+          <w:t xml:space="preserve">10.48550/arXiv.2610.02582</w:t>
+        </w:r>
+      </w:hyperlink>
+    </w:p>
+    <w:p>
+      <w:pPr>
+        <w:keepNext/>
+        <w:spacing w:before="0" w:after="0"/>
+      </w:pPr>
+      <w:r>
+        <w:rPr>
+          <w:b/>
+          <w:bCs/>
+          <w:sz w:val="21"/>
+          <w:szCs w:val="21"/>
+        </w:rPr>
+        <w:t xml:space="preserve">MFCC-Based Modeling of L1 Influence in L2 English Pronunciation: A Reproducible Methodological Pipeline</w:t>
+      </w:r>
+    </w:p>
+    <w:p>
+      <w:pPr>
+        <w:keepNext/>
+        <w:spacing w:before="20" w:after="0"/>
+      </w:pPr>
+      <w:r>
+        <w:rPr>
+          <w:b/>
+          <w:bCs/>
+          <w:sz w:val="20"/>
+          <w:szCs w:val="20"/>
+        </w:rPr>
+        <w:t xml:space="preserve">Peyman Jahanbin</w:t>
+      </w:r>
+    </w:p>
+    <w:p>
+      <w:pPr>
+        <w:keepLines/>
+        <w:spacing w:before="20" w:after="100"/>
+      </w:pPr>
+      <w:r>
+        <w:rPr>
+          <w:i/>
+          <w:iCs/>
+          <w:color w:val="5C6975"/>
+          <w:sz w:val="19"/>
+          <w:szCs w:val="19"/>
+        </w:rPr>
+        <w:t xml:space="preserve">Research Square</w:t>
+      </w:r>
+      <w:r>
+        <w:rPr>
+          <w:color w:val="5C6975"/>
+          <w:sz w:val="19"/>
+          <w:szCs w:val="19"/>
+        </w:rPr>
+        <w:t xml:space="preserve">. 2025; Methodological preprint</w:t>
+      </w:r>
+      <w:r>
+        <w:rPr>
+          <w:color w:val="5C6975"/>
+          <w:sz w:val="19"/>
+          <w:szCs w:val="19"/>
+        </w:rPr>
+        <w:t xml:space="preserve">. DOI: </w:t>
+      </w:r>
+      <w:hyperlink r:id="rIdL12" w:history="1">
+        <w:r>
+          <w:rPr>
+            <w:color w:val="1F4E79"/>
+            <w:sz w:val="19"/>
+            <w:szCs w:val="19"/>
+          </w:rPr>
           <w:t xml:space="preserve">10.21203/rs.3.rs-7032497/v1</w:t>
+        </w:r>
+      </w:hyperlink>
+    </w:p>
+    <w:p>
+      <w:pPr>
+        <w:keepNext/>
+        <w:spacing w:before="0" w:after="0"/>
+      </w:pPr>
+      <w:r>
+        <w:rPr>
+          <w:b/>
+          <w:bCs/>
+          <w:sz w:val="21"/>
+          <w:szCs w:val="21"/>
+        </w:rPr>
+        <w:t xml:space="preserve">Modeling L1 Influence on L2 Pronunciation: An MFCC-Based Framework for Explainable Machine Learning and Pedagogical Feedback</w:t>
+      </w:r>
+    </w:p>
+    <w:p>
+      <w:pPr>
+        <w:keepNext/>
+        <w:spacing w:before="20" w:after="0"/>
+      </w:pPr>
+      <w:r>
+        <w:rPr>
+          <w:b/>
+          <w:bCs/>
+          <w:sz w:val="20"/>
+          <w:szCs w:val="20"/>
+        </w:rPr>
+        <w:t xml:space="preserve">Peyman Jahanbin</w:t>
+      </w:r>
+    </w:p>
+    <w:p>
+      <w:pPr>
+        <w:keepLines/>
+        <w:spacing w:before="20" w:after="100"/>
+      </w:pPr>
+      <w:r>
+        <w:rPr>
+          <w:i/>
+          <w:iCs/>
+          <w:color w:val="5C6975"/>
+          <w:sz w:val="19"/>
+          <w:szCs w:val="19"/>
+        </w:rPr>
+        <w:t xml:space="preserve">arXiv</w:t>
+      </w:r>
+      <w:r>
+        <w:rPr>
+          <w:color w:val="5C6975"/>
+          <w:sz w:val="19"/>
+          <w:szCs w:val="19"/>
+        </w:rPr>
+        <w:t xml:space="preserve">. 2025; Preprint</w:t>
+      </w:r>
+      <w:r>
+        <w:rPr>
+          <w:color w:val="5C6975"/>
+          <w:sz w:val="19"/>
+          <w:szCs w:val="19"/>
+        </w:rPr>
+        <w:t xml:space="preserve">. DOI: </w:t>
+      </w:r>
+      <w:hyperlink r:id="rIdL13" w:history="1">
+        <w:r>
+          <w:rPr>
+            <w:color w:val="1F4E79"/>
+            <w:sz w:val="19"/>
+            <w:szCs w:val="19"/>
+          </w:rPr>
+          <w:t xml:space="preserve">10.48550/arXiv.2504.13765</w:t>
         </w:r>
       </w:hyperlink>
     </w:p>

</xml_diff>

<commit_message>
Merge the acoustic gap paper into its arXiv preprint, add MIDTESOL 2027 talk, simplify Peer Review
</commit_message>
<xml_diff>
--- a/Peyman_Jahanbin_CV.docx
+++ b/Peyman_Jahanbin_CV.docx
@@ -2096,60 +2096,6 @@
           <w:sz w:val="21"/>
           <w:szCs w:val="21"/>
         </w:rPr>
-        <w:t xml:space="preserve">Acoustic Gap Placement in Fixed-Passage Read Speech: A Comparison of Mandarin-L1 and American English-L1 Speakers</w:t>
-      </w:r>
-    </w:p>
-    <w:p>
-      <w:pPr>
-        <w:keepNext/>
-        <w:spacing w:before="20" w:after="0"/>
-      </w:pPr>
-      <w:r>
-        <w:rPr>
-          <w:b/>
-          <w:bCs/>
-          <w:sz w:val="20"/>
-          <w:szCs w:val="20"/>
-        </w:rPr>
-        <w:t xml:space="preserve">Peyman Jahanbin</w:t>
-      </w:r>
-    </w:p>
-    <w:p>
-      <w:pPr>
-        <w:keepLines/>
-        <w:spacing w:before="20" w:after="100"/>
-      </w:pPr>
-      <w:r>
-        <w:rPr>
-          <w:i/>
-          <w:iCs/>
-          <w:color w:val="5C6975"/>
-          <w:sz w:val="19"/>
-          <w:szCs w:val="19"/>
-        </w:rPr>
-        <w:t xml:space="preserve">PLOS ONE</w:t>
-      </w:r>
-      <w:r>
-        <w:rPr>
-          <w:color w:val="5C6975"/>
-          <w:sz w:val="19"/>
-          <w:szCs w:val="19"/>
-        </w:rPr>
-        <w:t xml:space="preserve">. Submitted August 30, 2026; Currently in editorial processing</w:t>
-      </w:r>
-    </w:p>
-    <w:p>
-      <w:pPr>
-        <w:keepNext/>
-        <w:spacing w:before="0" w:after="0"/>
-      </w:pPr>
-      <w:r>
-        <w:rPr>
-          <w:b/>
-          <w:bCs/>
-          <w:sz w:val="21"/>
-          <w:szCs w:val="21"/>
-        </w:rPr>
         <w:t xml:space="preserve">“The Accent Hides the Knowledge”: Raciolinguistic Gatekeeping and Algorithmic Suspicion of Middle Eastern Graduate Teaching Assistants in U.S. Higher Education</w:t>
       </w:r>
     </w:p>
@@ -2391,7 +2337,7 @@
           <w:sz w:val="19"/>
           <w:szCs w:val="19"/>
         </w:rPr>
-        <w:t xml:space="preserve">. 2026; Preprint</w:t>
+        <w:t xml:space="preserve">. 2026; Preprint; under review at PLOS ONE</w:t>
       </w:r>
       <w:r>
         <w:rPr>
@@ -2700,7 +2646,7 @@
           <w:sz w:val="20"/>
           <w:szCs w:val="20"/>
         </w:rPr>
-        <w:t xml:space="preserve">15 manuscript reviews for peer-reviewed journals, documented in Web of Science Researcher Profiles.</w:t>
+        <w:t xml:space="preserve">15 manuscript reviews for peer-reviewed journals.</w:t>
       </w:r>
     </w:p>
     <w:p>
@@ -2719,15 +2665,18 @@
       <w:r>
         <w:tab/>
       </w:r>
-      <w:r>
-        <w:rPr>
-          <w:i/>
-          <w:iCs/>
-          <w:sz w:val="20"/>
-          <w:szCs w:val="20"/>
-        </w:rPr>
-        <w:t xml:space="preserve">SAGE Open</w:t>
-      </w:r>
+      <w:hyperlink r:id="rIdL14" w:history="1">
+        <w:r>
+          <w:rPr>
+            <w:i/>
+            <w:iCs/>
+            <w:color w:val="1F4E79"/>
+            <w:sz w:val="20"/>
+            <w:szCs w:val="20"/>
+          </w:rPr>
+          <w:t xml:space="preserve">SAGE Open</w:t>
+        </w:r>
+      </w:hyperlink>
       <w:r>
         <w:rPr>
           <w:sz w:val="20"/>
@@ -2752,15 +2701,18 @@
       <w:r>
         <w:tab/>
       </w:r>
-      <w:r>
-        <w:rPr>
-          <w:i/>
-          <w:iCs/>
-          <w:sz w:val="20"/>
-          <w:szCs w:val="20"/>
-        </w:rPr>
-        <w:t xml:space="preserve">Journal of Research on Technology in Education</w:t>
-      </w:r>
+      <w:hyperlink r:id="rIdL15" w:history="1">
+        <w:r>
+          <w:rPr>
+            <w:i/>
+            <w:iCs/>
+            <w:color w:val="1F4E79"/>
+            <w:sz w:val="20"/>
+            <w:szCs w:val="20"/>
+          </w:rPr>
+          <w:t xml:space="preserve">Journal of Research on Technology in Education</w:t>
+        </w:r>
+      </w:hyperlink>
       <w:r>
         <w:rPr>
           <w:sz w:val="20"/>
@@ -3602,6 +3554,112 @@
         <w:t xml:space="preserve">Selected Conference Presentations</w:t>
       </w:r>
     </w:p>
+    <w:tbl>
+      <w:tblPr>
+        <w:tblW w:w="10166" w:type="dxa"/>
+        <w:tblLayout w:type="fixed"/>
+        <w:tblCellMar>
+          <w:left w:w="0" w:type="dxa"/>
+          <w:right w:w="0" w:type="dxa"/>
+        </w:tblCellMar>
+      </w:tblPr>
+      <w:tblGrid>
+        <w:gridCol w:w="6600"/>
+        <w:gridCol w:w="3566"/>
+      </w:tblGrid>
+      <w:tr>
+        <w:trPr>
+          <w:cantSplit/>
+        </w:trPr>
+        <w:tc>
+          <w:tcPr>
+            <w:tcW w:w="6600" w:type="dxa"/>
+          </w:tcPr>
+          <w:p>
+            <w:pPr>
+              <w:keepNext/>
+              <w:spacing w:before="0" w:after="0"/>
+            </w:pPr>
+            <w:r>
+              <w:rPr>
+                <w:b/>
+                <w:bCs/>
+                <w:sz w:val="21"/>
+                <w:szCs w:val="21"/>
+              </w:rPr>
+              <w:t xml:space="preserve">Beyond Symbolic Recognition: Examining Access, Fidelity, and Student Outcomes in the Seal of Biliteracy</w:t>
+            </w:r>
+          </w:p>
+        </w:tc>
+        <w:tc>
+          <w:tcPr>
+            <w:tcW w:w="3566" w:type="dxa"/>
+          </w:tcPr>
+          <w:p>
+            <w:pPr>
+              <w:keepNext/>
+              <w:spacing w:before="0" w:after="0"/>
+              <w:jc w:val="right"/>
+            </w:pPr>
+            <w:r>
+              <w:rPr>
+                <w:b/>
+                <w:bCs/>
+                <w:sz w:val="20"/>
+                <w:szCs w:val="20"/>
+              </w:rPr>
+              <w:t xml:space="preserve">October 2026</w:t>
+            </w:r>
+          </w:p>
+        </w:tc>
+      </w:tr>
+      <w:tr>
+        <w:trPr>
+          <w:cantSplit/>
+        </w:trPr>
+        <w:tc>
+          <w:tcPr>
+            <w:tcW w:w="6600" w:type="dxa"/>
+          </w:tcPr>
+          <w:p>
+            <w:pPr>
+              <w:spacing w:before="0" w:after="100"/>
+            </w:pPr>
+            <w:r>
+              <w:rPr>
+                <w:i/>
+                <w:iCs/>
+                <w:color w:val="5C6975"/>
+                <w:sz w:val="19"/>
+                <w:szCs w:val="19"/>
+              </w:rPr>
+              <w:t xml:space="preserve">MIDTESOL 2027</w:t>
+            </w:r>
+          </w:p>
+        </w:tc>
+        <w:tc>
+          <w:tcPr>
+            <w:tcW w:w="3566" w:type="dxa"/>
+          </w:tcPr>
+          <w:p>
+            <w:pPr>
+              <w:spacing w:before="0" w:after="100"/>
+              <w:jc w:val="right"/>
+            </w:pPr>
+            <w:r>
+              <w:rPr>
+                <w:i/>
+                <w:iCs/>
+                <w:color w:val="5C6975"/>
+                <w:sz w:val="19"/>
+                <w:szCs w:val="19"/>
+              </w:rPr>
+              <w:t xml:space="preserve"/>
+            </w:r>
+          </w:p>
+        </w:tc>
+      </w:tr>
+    </w:tbl>
     <w:tbl>
       <w:tblPr>
         <w:tblW w:w="10166" w:type="dxa"/>

</xml_diff>